<commit_message>
v1.6: Add footer-cropped PNG export and preset deletion button
</commit_message>
<xml_diff>
--- a/METHODOLOGY_AI Parameter_Advisor .docx
+++ b/METHODOLOGY_AI Parameter_Advisor .docx
@@ -25,11 +25,10 @@
           <w:bCs/>
           <w:color w:val="1F1F1F"/>
           <w:kern w:val="0"/>
-          <w:sz w:val="36"/>
-          <w:szCs w:val="36"/>
-          <w14:ligatures w14:val="none"/>
-        </w:rPr>
-        <w:t>METHODOLOGY</w:t>
+          <w:bdr w:val="none" w:sz="0" w:space="0" w:color="auto" w:frame="1"/>
+          <w14:ligatures w14:val="none"/>
+        </w:rPr>
+        <w:t>AI</w:t>
       </w:r>
       <w:r>
         <w:rPr>
@@ -38,11 +37,396 @@
           <w:bCs/>
           <w:color w:val="1F1F1F"/>
           <w:kern w:val="0"/>
-          <w:sz w:val="36"/>
-          <w:szCs w:val="36"/>
-          <w14:ligatures w14:val="none"/>
-        </w:rPr>
-        <w:t xml:space="preserve"> FULL</w:t>
+          <w:bdr w:val="none" w:sz="0" w:space="0" w:color="auto" w:frame="1"/>
+          <w14:ligatures w14:val="none"/>
+        </w:rPr>
+        <w:t xml:space="preserve"> </w:t>
+      </w:r>
+      <w:r>
+        <w:rPr>
+          <w:rFonts w:ascii="Arial" w:eastAsia="Times New Roman" w:hAnsi="Arial" w:cs="Arial"/>
+          <w:b/>
+          <w:bCs/>
+          <w:color w:val="1F1F1F"/>
+          <w:kern w:val="0"/>
+          <w:bdr w:val="none" w:sz="0" w:space="0" w:color="auto" w:frame="1"/>
+          <w14:ligatures w14:val="none"/>
+        </w:rPr>
+        <w:t>Parameter</w:t>
+      </w:r>
+      <w:r>
+        <w:rPr>
+          <w:rFonts w:ascii="Arial" w:eastAsia="Times New Roman" w:hAnsi="Arial" w:cs="Arial"/>
+          <w:b/>
+          <w:bCs/>
+          <w:color w:val="1F1F1F"/>
+          <w:kern w:val="0"/>
+          <w:bdr w:val="none" w:sz="0" w:space="0" w:color="auto" w:frame="1"/>
+          <w14:ligatures w14:val="none"/>
+        </w:rPr>
+        <w:t xml:space="preserve"> </w:t>
+      </w:r>
+      <w:r>
+        <w:rPr>
+          <w:rFonts w:ascii="Arial" w:eastAsia="Times New Roman" w:hAnsi="Arial" w:cs="Arial"/>
+          <w:b/>
+          <w:bCs/>
+          <w:color w:val="1F1F1F"/>
+          <w:kern w:val="0"/>
+          <w:bdr w:val="none" w:sz="0" w:space="0" w:color="auto" w:frame="1"/>
+          <w14:ligatures w14:val="none"/>
+        </w:rPr>
+        <w:t>Advisor</w:t>
+      </w:r>
+      <w:r>
+        <w:rPr>
+          <w:rFonts w:ascii="Arial" w:eastAsia="Times New Roman" w:hAnsi="Arial" w:cs="Arial"/>
+          <w:b/>
+          <w:bCs/>
+          <w:color w:val="1F1F1F"/>
+          <w:kern w:val="0"/>
+          <w:bdr w:val="none" w:sz="0" w:space="0" w:color="auto" w:frame="1"/>
+          <w14:ligatures w14:val="none"/>
+        </w:rPr>
+        <w:t xml:space="preserve"> </w:t>
+      </w:r>
+      <w:r>
+        <w:rPr>
+          <w:rFonts w:ascii="Arial" w:eastAsia="Times New Roman" w:hAnsi="Arial" w:cs="Arial"/>
+          <w:b/>
+          <w:bCs/>
+          <w:color w:val="1F1F1F"/>
+          <w:kern w:val="0"/>
+          <w:bdr w:val="none" w:sz="0" w:space="0" w:color="auto" w:frame="1"/>
+          <w:lang w:val="ru-RU"/>
+          <w14:ligatures w14:val="none"/>
+        </w:rPr>
+        <w:t>для</w:t>
+      </w:r>
+      <w:r>
+        <w:rPr>
+          <w:rFonts w:ascii="Arial" w:eastAsia="Times New Roman" w:hAnsi="Arial" w:cs="Arial"/>
+          <w:b/>
+          <w:bCs/>
+          <w:color w:val="1F1F1F"/>
+          <w:kern w:val="0"/>
+          <w:bdr w:val="none" w:sz="0" w:space="0" w:color="auto" w:frame="1"/>
+          <w14:ligatures w14:val="none"/>
+        </w:rPr>
+        <w:t xml:space="preserve"> </w:t>
+      </w:r>
+      <w:r>
+        <w:rPr>
+          <w:rFonts w:ascii="Arial" w:eastAsia="Times New Roman" w:hAnsi="Arial" w:cs="Arial"/>
+          <w:b/>
+          <w:bCs/>
+          <w:color w:val="1F1F1F"/>
+          <w:kern w:val="0"/>
+          <w:bdr w:val="none" w:sz="0" w:space="0" w:color="auto" w:frame="1"/>
+          <w14:ligatures w14:val="none"/>
+        </w:rPr>
+        <w:t>SEM</w:t>
+      </w:r>
+      <w:r>
+        <w:rPr>
+          <w:rFonts w:ascii="Arial" w:eastAsia="Times New Roman" w:hAnsi="Arial" w:cs="Arial"/>
+          <w:b/>
+          <w:bCs/>
+          <w:color w:val="1F1F1F"/>
+          <w:kern w:val="0"/>
+          <w:bdr w:val="none" w:sz="0" w:space="0" w:color="auto" w:frame="1"/>
+          <w14:ligatures w14:val="none"/>
+        </w:rPr>
+        <w:t xml:space="preserve"> </w:t>
+      </w:r>
+      <w:r>
+        <w:rPr>
+          <w:rFonts w:ascii="Arial" w:eastAsia="Times New Roman" w:hAnsi="Arial" w:cs="Arial"/>
+          <w:color w:val="1F1F1F"/>
+          <w:kern w:val="0"/>
+          <w:bdr w:val="none" w:sz="0" w:space="0" w:color="auto" w:frame="1"/>
+          <w:lang w:val="en-US"/>
+          <w14:ligatures w14:val="none"/>
+        </w:rPr>
+        <w:t xml:space="preserve">and </w:t>
+      </w:r>
+      <w:r>
+        <w:rPr>
+          <w:rFonts w:ascii="Apple Color Emoji" w:eastAsia="Times New Roman" w:hAnsi="Apple Color Emoji" w:cs="Apple Color Emoji"/>
+          <w:b/>
+          <w:bCs/>
+          <w:color w:val="1F1F1F"/>
+          <w:kern w:val="0"/>
+          <w:bdr w:val="none" w:sz="0" w:space="0" w:color="auto" w:frame="1"/>
+          <w14:ligatures w14:val="none"/>
+        </w:rPr>
+        <w:t>🪄</w:t>
+      </w:r>
+      <w:r>
+        <w:rPr>
+          <w:rFonts w:ascii="Arial" w:eastAsia="Times New Roman" w:hAnsi="Arial" w:cs="Arial"/>
+          <w:b/>
+          <w:bCs/>
+          <w:color w:val="1F1F1F"/>
+          <w:kern w:val="0"/>
+          <w:bdr w:val="none" w:sz="0" w:space="0" w:color="auto" w:frame="1"/>
+          <w14:ligatures w14:val="none"/>
+        </w:rPr>
+        <w:t xml:space="preserve"> </w:t>
+      </w:r>
+      <w:r>
+        <w:rPr>
+          <w:rFonts w:ascii="Arial" w:eastAsia="Times New Roman" w:hAnsi="Arial" w:cs="Arial"/>
+          <w:b/>
+          <w:bCs/>
+          <w:color w:val="1F1F1F"/>
+          <w:kern w:val="0"/>
+          <w:bdr w:val="none" w:sz="0" w:space="0" w:color="auto" w:frame="1"/>
+          <w14:ligatures w14:val="none"/>
+        </w:rPr>
+        <w:t>AI</w:t>
+      </w:r>
+      <w:r>
+        <w:rPr>
+          <w:rFonts w:ascii="Arial" w:eastAsia="Times New Roman" w:hAnsi="Arial" w:cs="Arial"/>
+          <w:b/>
+          <w:bCs/>
+          <w:color w:val="1F1F1F"/>
+          <w:kern w:val="0"/>
+          <w:bdr w:val="none" w:sz="0" w:space="0" w:color="auto" w:frame="1"/>
+          <w14:ligatures w14:val="none"/>
+        </w:rPr>
+        <w:t xml:space="preserve"> </w:t>
+      </w:r>
+      <w:r>
+        <w:rPr>
+          <w:rFonts w:ascii="Arial" w:eastAsia="Times New Roman" w:hAnsi="Arial" w:cs="Arial"/>
+          <w:b/>
+          <w:bCs/>
+          <w:color w:val="1F1F1F"/>
+          <w:kern w:val="0"/>
+          <w:bdr w:val="none" w:sz="0" w:space="0" w:color="auto" w:frame="1"/>
+          <w14:ligatures w14:val="none"/>
+        </w:rPr>
+        <w:t>Parameter</w:t>
+      </w:r>
+      <w:r>
+        <w:rPr>
+          <w:rFonts w:ascii="Arial" w:eastAsia="Times New Roman" w:hAnsi="Arial" w:cs="Arial"/>
+          <w:b/>
+          <w:bCs/>
+          <w:color w:val="1F1F1F"/>
+          <w:kern w:val="0"/>
+          <w:bdr w:val="none" w:sz="0" w:space="0" w:color="auto" w:frame="1"/>
+          <w14:ligatures w14:val="none"/>
+        </w:rPr>
+        <w:t xml:space="preserve"> </w:t>
+      </w:r>
+      <w:r>
+        <w:rPr>
+          <w:rFonts w:ascii="Arial" w:eastAsia="Times New Roman" w:hAnsi="Arial" w:cs="Arial"/>
+          <w:b/>
+          <w:bCs/>
+          <w:color w:val="1F1F1F"/>
+          <w:kern w:val="0"/>
+          <w:bdr w:val="none" w:sz="0" w:space="0" w:color="auto" w:frame="1"/>
+          <w14:ligatures w14:val="none"/>
+        </w:rPr>
+        <w:t>Advisor</w:t>
+      </w:r>
+      <w:r>
+        <w:rPr>
+          <w:rFonts w:ascii="Arial" w:eastAsia="Times New Roman" w:hAnsi="Arial" w:cs="Arial"/>
+          <w:b/>
+          <w:bCs/>
+          <w:color w:val="1F1F1F"/>
+          <w:kern w:val="0"/>
+          <w:bdr w:val="none" w:sz="0" w:space="0" w:color="auto" w:frame="1"/>
+          <w14:ligatures w14:val="none"/>
+        </w:rPr>
+        <w:t xml:space="preserve"> </w:t>
+      </w:r>
+      <w:r>
+        <w:rPr>
+          <w:rFonts w:ascii="Arial" w:eastAsia="Times New Roman" w:hAnsi="Arial" w:cs="Arial"/>
+          <w:b/>
+          <w:bCs/>
+          <w:color w:val="1F1F1F"/>
+          <w:kern w:val="0"/>
+          <w:bdr w:val="none" w:sz="0" w:space="0" w:color="auto" w:frame="1"/>
+          <w:lang w:val="ru-RU"/>
+          <w14:ligatures w14:val="none"/>
+        </w:rPr>
+        <w:t>та</w:t>
+      </w:r>
+      <w:r>
+        <w:rPr>
+          <w:rFonts w:ascii="Arial" w:eastAsia="Times New Roman" w:hAnsi="Arial" w:cs="Arial"/>
+          <w:b/>
+          <w:bCs/>
+          <w:color w:val="1F1F1F"/>
+          <w:kern w:val="0"/>
+          <w:bdr w:val="none" w:sz="0" w:space="0" w:color="auto" w:frame="1"/>
+          <w14:ligatures w14:val="none"/>
+        </w:rPr>
+        <w:t xml:space="preserve"> </w:t>
+      </w:r>
+      <w:r>
+        <w:rPr>
+          <w:rFonts w:ascii="Arial" w:eastAsia="Times New Roman" w:hAnsi="Arial" w:cs="Arial"/>
+          <w:b/>
+          <w:bCs/>
+          <w:color w:val="1F1F1F"/>
+          <w:kern w:val="0"/>
+          <w:bdr w:val="none" w:sz="0" w:space="0" w:color="auto" w:frame="1"/>
+          <w14:ligatures w14:val="none"/>
+        </w:rPr>
+        <w:t>Multi</w:t>
+      </w:r>
+      <w:r>
+        <w:rPr>
+          <w:rFonts w:ascii="Arial" w:eastAsia="Times New Roman" w:hAnsi="Arial" w:cs="Arial"/>
+          <w:b/>
+          <w:bCs/>
+          <w:color w:val="1F1F1F"/>
+          <w:kern w:val="0"/>
+          <w:bdr w:val="none" w:sz="0" w:space="0" w:color="auto" w:frame="1"/>
+          <w14:ligatures w14:val="none"/>
+        </w:rPr>
+        <w:t>-</w:t>
+      </w:r>
+      <w:r>
+        <w:rPr>
+          <w:rFonts w:ascii="Arial" w:eastAsia="Times New Roman" w:hAnsi="Arial" w:cs="Arial"/>
+          <w:b/>
+          <w:bCs/>
+          <w:color w:val="1F1F1F"/>
+          <w:kern w:val="0"/>
+          <w:bdr w:val="none" w:sz="0" w:space="0" w:color="auto" w:frame="1"/>
+          <w14:ligatures w14:val="none"/>
+        </w:rPr>
+        <w:t>Scale</w:t>
+      </w:r>
+      <w:r>
+        <w:rPr>
+          <w:rFonts w:ascii="Arial" w:eastAsia="Times New Roman" w:hAnsi="Arial" w:cs="Arial"/>
+          <w:b/>
+          <w:bCs/>
+          <w:color w:val="1F1F1F"/>
+          <w:kern w:val="0"/>
+          <w:bdr w:val="none" w:sz="0" w:space="0" w:color="auto" w:frame="1"/>
+          <w14:ligatures w14:val="none"/>
+        </w:rPr>
+        <w:t xml:space="preserve"> </w:t>
+      </w:r>
+      <w:r>
+        <w:rPr>
+          <w:rFonts w:ascii="Arial" w:eastAsia="Times New Roman" w:hAnsi="Arial" w:cs="Arial"/>
+          <w:b/>
+          <w:bCs/>
+          <w:color w:val="1F1F1F"/>
+          <w:kern w:val="0"/>
+          <w:bdr w:val="none" w:sz="0" w:space="0" w:color="auto" w:frame="1"/>
+          <w14:ligatures w14:val="none"/>
+        </w:rPr>
+        <w:t>Crystallized</w:t>
+      </w:r>
+      <w:r>
+        <w:rPr>
+          <w:rFonts w:ascii="Arial" w:eastAsia="Times New Roman" w:hAnsi="Arial" w:cs="Arial"/>
+          <w:b/>
+          <w:bCs/>
+          <w:color w:val="1F1F1F"/>
+          <w:kern w:val="0"/>
+          <w:bdr w:val="none" w:sz="0" w:space="0" w:color="auto" w:frame="1"/>
+          <w14:ligatures w14:val="none"/>
+        </w:rPr>
+        <w:t xml:space="preserve"> </w:t>
+      </w:r>
+      <w:r>
+        <w:rPr>
+          <w:rFonts w:ascii="Arial" w:eastAsia="Times New Roman" w:hAnsi="Arial" w:cs="Arial"/>
+          <w:b/>
+          <w:bCs/>
+          <w:color w:val="1F1F1F"/>
+          <w:kern w:val="0"/>
+          <w:bdr w:val="none" w:sz="0" w:space="0" w:color="auto" w:frame="1"/>
+          <w14:ligatures w14:val="none"/>
+        </w:rPr>
+        <w:t>Segmentation</w:t>
+      </w:r>
+      <w:r>
+        <w:rPr>
+          <w:rFonts w:ascii="Arial" w:eastAsia="Times New Roman" w:hAnsi="Arial" w:cs="Arial"/>
+          <w:b/>
+          <w:bCs/>
+          <w:color w:val="1F1F1F"/>
+          <w:kern w:val="0"/>
+          <w:bdr w:val="none" w:sz="0" w:space="0" w:color="auto" w:frame="1"/>
+          <w14:ligatures w14:val="none"/>
+        </w:rPr>
+        <w:t xml:space="preserve"> </w:t>
+      </w:r>
+      <w:r>
+        <w:rPr>
+          <w:rFonts w:ascii="Arial" w:eastAsia="Times New Roman" w:hAnsi="Arial" w:cs="Arial"/>
+          <w:b/>
+          <w:bCs/>
+          <w:color w:val="1F1F1F"/>
+          <w:kern w:val="0"/>
+          <w:bdr w:val="none" w:sz="0" w:space="0" w:color="auto" w:frame="1"/>
+          <w:lang w:val="en-US"/>
+          <w14:ligatures w14:val="none"/>
+        </w:rPr>
+        <w:t>for</w:t>
+      </w:r>
+      <w:r>
+        <w:rPr>
+          <w:rFonts w:ascii="Arial" w:eastAsia="Times New Roman" w:hAnsi="Arial" w:cs="Arial"/>
+          <w:b/>
+          <w:bCs/>
+          <w:color w:val="1F1F1F"/>
+          <w:kern w:val="0"/>
+          <w:bdr w:val="none" w:sz="0" w:space="0" w:color="auto" w:frame="1"/>
+          <w14:ligatures w14:val="none"/>
+        </w:rPr>
+        <w:t xml:space="preserve"> </w:t>
+      </w:r>
+      <w:r>
+        <w:rPr>
+          <w:rFonts w:ascii="Arial" w:eastAsia="Times New Roman" w:hAnsi="Arial" w:cs="Arial"/>
+          <w:b/>
+          <w:bCs/>
+          <w:color w:val="1F1F1F"/>
+          <w:kern w:val="0"/>
+          <w:bdr w:val="none" w:sz="0" w:space="0" w:color="auto" w:frame="1"/>
+          <w14:ligatures w14:val="none"/>
+        </w:rPr>
+        <w:t>Light</w:t>
+      </w:r>
+      <w:r>
+        <w:rPr>
+          <w:rFonts w:ascii="Arial" w:eastAsia="Times New Roman" w:hAnsi="Arial" w:cs="Arial"/>
+          <w:b/>
+          <w:bCs/>
+          <w:color w:val="1F1F1F"/>
+          <w:kern w:val="0"/>
+          <w:bdr w:val="none" w:sz="0" w:space="0" w:color="auto" w:frame="1"/>
+          <w14:ligatures w14:val="none"/>
+        </w:rPr>
+        <w:t xml:space="preserve"> </w:t>
+      </w:r>
+      <w:r>
+        <w:rPr>
+          <w:rFonts w:ascii="Arial" w:eastAsia="Times New Roman" w:hAnsi="Arial" w:cs="Arial"/>
+          <w:b/>
+          <w:bCs/>
+          <w:color w:val="1F1F1F"/>
+          <w:kern w:val="0"/>
+          <w:bdr w:val="none" w:sz="0" w:space="0" w:color="auto" w:frame="1"/>
+          <w14:ligatures w14:val="none"/>
+        </w:rPr>
+        <w:t>Microscopy</w:t>
       </w:r>
     </w:p>
     <w:p>
@@ -95,7 +479,7 @@
           <w:bdr w:val="none" w:sz="0" w:space="0" w:color="auto" w:frame="1"/>
           <w14:ligatures w14:val="none"/>
         </w:rPr>
-        <w:t>Parameter</w:t>
+        <w:t>Smart</w:t>
       </w:r>
       <w:r>
         <w:rPr>
@@ -119,7 +503,7 @@
           <w:bdr w:val="none" w:sz="0" w:space="0" w:color="auto" w:frame="1"/>
           <w14:ligatures w14:val="none"/>
         </w:rPr>
-        <w:t>Advisor</w:t>
+        <w:t>Box</w:t>
       </w:r>
       <w:r>
         <w:rPr>
@@ -131,7 +515,7 @@
           <w:bdr w:val="none" w:sz="0" w:space="0" w:color="auto" w:frame="1"/>
           <w14:ligatures w14:val="none"/>
         </w:rPr>
-        <w:t xml:space="preserve"> </w:t>
+        <w:t xml:space="preserve"> (</w:t>
       </w:r>
       <w:r>
         <w:rPr>
@@ -141,10 +525,9 @@
           <w:color w:val="1F1F1F"/>
           <w:kern w:val="0"/>
           <w:bdr w:val="none" w:sz="0" w:space="0" w:color="auto" w:frame="1"/>
-          <w:lang w:val="ru-RU"/>
-          <w14:ligatures w14:val="none"/>
-        </w:rPr>
-        <w:t>для</w:t>
+          <w14:ligatures w14:val="none"/>
+        </w:rPr>
+        <w:t>SAM</w:t>
       </w:r>
       <w:r>
         <w:rPr>
@@ -156,7 +539,7 @@
           <w:bdr w:val="none" w:sz="0" w:space="0" w:color="auto" w:frame="1"/>
           <w14:ligatures w14:val="none"/>
         </w:rPr>
-        <w:t xml:space="preserve"> </w:t>
+        <w:t xml:space="preserve"> 5-</w:t>
       </w:r>
       <w:r>
         <w:rPr>
@@ -168,7 +551,7 @@
           <w:bdr w:val="none" w:sz="0" w:space="0" w:color="auto" w:frame="1"/>
           <w14:ligatures w14:val="none"/>
         </w:rPr>
-        <w:t>SEM</w:t>
+        <w:t>Point</w:t>
       </w:r>
       <w:r>
         <w:rPr>
@@ -180,22 +563,11 @@
           <w:bdr w:val="none" w:sz="0" w:space="0" w:color="auto" w:frame="1"/>
           <w14:ligatures w14:val="none"/>
         </w:rPr>
-        <w:t xml:space="preserve"> </w:t>
-      </w:r>
-      <w:r>
-        <w:rPr>
-          <w:rFonts w:ascii="Arial" w:eastAsia="Times New Roman" w:hAnsi="Arial" w:cs="Arial"/>
-          <w:color w:val="1F1F1F"/>
-          <w:kern w:val="0"/>
-          <w:bdr w:val="none" w:sz="0" w:space="0" w:color="auto" w:frame="1"/>
-          <w:lang w:val="en-US"/>
-          <w14:ligatures w14:val="none"/>
-        </w:rPr>
-        <w:t xml:space="preserve">and </w:t>
-      </w:r>
-      <w:r>
-        <w:rPr>
-          <w:rFonts w:ascii="Apple Color Emoji" w:eastAsia="Times New Roman" w:hAnsi="Apple Color Emoji" w:cs="Apple Color Emoji"/>
+        <w:t xml:space="preserve"> + </w:t>
+      </w:r>
+      <w:r>
+        <w:rPr>
+          <w:rFonts w:ascii="Arial" w:eastAsia="Times New Roman" w:hAnsi="Arial" w:cs="Arial"/>
           <w:b/>
           <w:bCs/>
           <w:color w:val="1F1F1F"/>
@@ -203,7 +575,7 @@
           <w:bdr w:val="none" w:sz="0" w:space="0" w:color="auto" w:frame="1"/>
           <w14:ligatures w14:val="none"/>
         </w:rPr>
-        <w:t>🪄</w:t>
+        <w:t>Box</w:t>
       </w:r>
       <w:r>
         <w:rPr>
@@ -227,7 +599,7 @@
           <w:bdr w:val="none" w:sz="0" w:space="0" w:color="auto" w:frame="1"/>
           <w14:ligatures w14:val="none"/>
         </w:rPr>
-        <w:t>AI</w:t>
+        <w:t>Prompt</w:t>
       </w:r>
       <w:r>
         <w:rPr>
@@ -249,9 +621,10 @@
           <w:color w:val="1F1F1F"/>
           <w:kern w:val="0"/>
           <w:bdr w:val="none" w:sz="0" w:space="0" w:color="auto" w:frame="1"/>
-          <w14:ligatures w14:val="none"/>
-        </w:rPr>
-        <w:t>Parameter</w:t>
+          <w:lang w:val="en-US"/>
+          <w14:ligatures w14:val="none"/>
+        </w:rPr>
+        <w:t>and</w:t>
       </w:r>
       <w:r>
         <w:rPr>
@@ -275,427 +648,8 @@
           <w:bdr w:val="none" w:sz="0" w:space="0" w:color="auto" w:frame="1"/>
           <w14:ligatures w14:val="none"/>
         </w:rPr>
-        <w:t>Advisor</w:t>
-      </w:r>
-      <w:r>
-        <w:rPr>
-          <w:rFonts w:ascii="Arial" w:eastAsia="Times New Roman" w:hAnsi="Arial" w:cs="Arial"/>
-          <w:b/>
-          <w:bCs/>
-          <w:color w:val="1F1F1F"/>
-          <w:kern w:val="0"/>
-          <w:bdr w:val="none" w:sz="0" w:space="0" w:color="auto" w:frame="1"/>
-          <w14:ligatures w14:val="none"/>
-        </w:rPr>
-        <w:t xml:space="preserve"> </w:t>
-      </w:r>
-      <w:r>
-        <w:rPr>
-          <w:rFonts w:ascii="Arial" w:eastAsia="Times New Roman" w:hAnsi="Arial" w:cs="Arial"/>
-          <w:b/>
-          <w:bCs/>
-          <w:color w:val="1F1F1F"/>
-          <w:kern w:val="0"/>
-          <w:bdr w:val="none" w:sz="0" w:space="0" w:color="auto" w:frame="1"/>
-          <w:lang w:val="ru-RU"/>
-          <w14:ligatures w14:val="none"/>
-        </w:rPr>
-        <w:t>та</w:t>
-      </w:r>
-      <w:r>
-        <w:rPr>
-          <w:rFonts w:ascii="Arial" w:eastAsia="Times New Roman" w:hAnsi="Arial" w:cs="Arial"/>
-          <w:b/>
-          <w:bCs/>
-          <w:color w:val="1F1F1F"/>
-          <w:kern w:val="0"/>
-          <w:bdr w:val="none" w:sz="0" w:space="0" w:color="auto" w:frame="1"/>
-          <w14:ligatures w14:val="none"/>
-        </w:rPr>
-        <w:t xml:space="preserve"> </w:t>
-      </w:r>
-      <w:r>
-        <w:rPr>
-          <w:rFonts w:ascii="Arial" w:eastAsia="Times New Roman" w:hAnsi="Arial" w:cs="Arial"/>
-          <w:b/>
-          <w:bCs/>
-          <w:color w:val="1F1F1F"/>
-          <w:kern w:val="0"/>
-          <w:bdr w:val="none" w:sz="0" w:space="0" w:color="auto" w:frame="1"/>
-          <w14:ligatures w14:val="none"/>
-        </w:rPr>
-        <w:t>Multi</w:t>
-      </w:r>
-      <w:r>
-        <w:rPr>
-          <w:rFonts w:ascii="Arial" w:eastAsia="Times New Roman" w:hAnsi="Arial" w:cs="Arial"/>
-          <w:b/>
-          <w:bCs/>
-          <w:color w:val="1F1F1F"/>
-          <w:kern w:val="0"/>
-          <w:bdr w:val="none" w:sz="0" w:space="0" w:color="auto" w:frame="1"/>
-          <w14:ligatures w14:val="none"/>
-        </w:rPr>
-        <w:t>-</w:t>
-      </w:r>
-      <w:r>
-        <w:rPr>
-          <w:rFonts w:ascii="Arial" w:eastAsia="Times New Roman" w:hAnsi="Arial" w:cs="Arial"/>
-          <w:b/>
-          <w:bCs/>
-          <w:color w:val="1F1F1F"/>
-          <w:kern w:val="0"/>
-          <w:bdr w:val="none" w:sz="0" w:space="0" w:color="auto" w:frame="1"/>
-          <w14:ligatures w14:val="none"/>
-        </w:rPr>
-        <w:t>Scale</w:t>
-      </w:r>
-      <w:r>
-        <w:rPr>
-          <w:rFonts w:ascii="Arial" w:eastAsia="Times New Roman" w:hAnsi="Arial" w:cs="Arial"/>
-          <w:b/>
-          <w:bCs/>
-          <w:color w:val="1F1F1F"/>
-          <w:kern w:val="0"/>
-          <w:bdr w:val="none" w:sz="0" w:space="0" w:color="auto" w:frame="1"/>
-          <w14:ligatures w14:val="none"/>
-        </w:rPr>
-        <w:t xml:space="preserve"> </w:t>
-      </w:r>
-      <w:r>
-        <w:rPr>
-          <w:rFonts w:ascii="Arial" w:eastAsia="Times New Roman" w:hAnsi="Arial" w:cs="Arial"/>
-          <w:b/>
-          <w:bCs/>
-          <w:color w:val="1F1F1F"/>
-          <w:kern w:val="0"/>
-          <w:bdr w:val="none" w:sz="0" w:space="0" w:color="auto" w:frame="1"/>
-          <w14:ligatures w14:val="none"/>
-        </w:rPr>
-        <w:t>Crystallized</w:t>
-      </w:r>
-      <w:r>
-        <w:rPr>
-          <w:rFonts w:ascii="Arial" w:eastAsia="Times New Roman" w:hAnsi="Arial" w:cs="Arial"/>
-          <w:b/>
-          <w:bCs/>
-          <w:color w:val="1F1F1F"/>
-          <w:kern w:val="0"/>
-          <w:bdr w:val="none" w:sz="0" w:space="0" w:color="auto" w:frame="1"/>
-          <w14:ligatures w14:val="none"/>
-        </w:rPr>
-        <w:t xml:space="preserve"> </w:t>
-      </w:r>
-      <w:r>
-        <w:rPr>
-          <w:rFonts w:ascii="Arial" w:eastAsia="Times New Roman" w:hAnsi="Arial" w:cs="Arial"/>
-          <w:b/>
-          <w:bCs/>
-          <w:color w:val="1F1F1F"/>
-          <w:kern w:val="0"/>
-          <w:bdr w:val="none" w:sz="0" w:space="0" w:color="auto" w:frame="1"/>
-          <w14:ligatures w14:val="none"/>
-        </w:rPr>
-        <w:t>Segmentation</w:t>
-      </w:r>
-      <w:r>
-        <w:rPr>
-          <w:rFonts w:ascii="Arial" w:eastAsia="Times New Roman" w:hAnsi="Arial" w:cs="Arial"/>
-          <w:b/>
-          <w:bCs/>
-          <w:color w:val="1F1F1F"/>
-          <w:kern w:val="0"/>
-          <w:bdr w:val="none" w:sz="0" w:space="0" w:color="auto" w:frame="1"/>
-          <w14:ligatures w14:val="none"/>
-        </w:rPr>
-        <w:t xml:space="preserve"> </w:t>
-      </w:r>
-      <w:r>
-        <w:rPr>
-          <w:rFonts w:ascii="Arial" w:eastAsia="Times New Roman" w:hAnsi="Arial" w:cs="Arial"/>
-          <w:b/>
-          <w:bCs/>
-          <w:color w:val="1F1F1F"/>
-          <w:kern w:val="0"/>
-          <w:bdr w:val="none" w:sz="0" w:space="0" w:color="auto" w:frame="1"/>
-          <w:lang w:val="ru-RU"/>
-          <w14:ligatures w14:val="none"/>
-        </w:rPr>
-        <w:t>для</w:t>
-      </w:r>
-      <w:r>
-        <w:rPr>
-          <w:rFonts w:ascii="Arial" w:eastAsia="Times New Roman" w:hAnsi="Arial" w:cs="Arial"/>
-          <w:b/>
-          <w:bCs/>
-          <w:color w:val="1F1F1F"/>
-          <w:kern w:val="0"/>
-          <w:bdr w:val="none" w:sz="0" w:space="0" w:color="auto" w:frame="1"/>
-          <w14:ligatures w14:val="none"/>
-        </w:rPr>
-        <w:t xml:space="preserve"> </w:t>
-      </w:r>
-      <w:r>
-        <w:rPr>
-          <w:rFonts w:ascii="Arial" w:eastAsia="Times New Roman" w:hAnsi="Arial" w:cs="Arial"/>
-          <w:b/>
-          <w:bCs/>
-          <w:color w:val="1F1F1F"/>
-          <w:kern w:val="0"/>
-          <w:bdr w:val="none" w:sz="0" w:space="0" w:color="auto" w:frame="1"/>
-          <w14:ligatures w14:val="none"/>
-        </w:rPr>
-        <w:t>Light</w:t>
-      </w:r>
-      <w:r>
-        <w:rPr>
-          <w:rFonts w:ascii="Arial" w:eastAsia="Times New Roman" w:hAnsi="Arial" w:cs="Arial"/>
-          <w:b/>
-          <w:bCs/>
-          <w:color w:val="1F1F1F"/>
-          <w:kern w:val="0"/>
-          <w:bdr w:val="none" w:sz="0" w:space="0" w:color="auto" w:frame="1"/>
-          <w14:ligatures w14:val="none"/>
-        </w:rPr>
-        <w:t xml:space="preserve"> </w:t>
-      </w:r>
-      <w:r>
-        <w:rPr>
-          <w:rFonts w:ascii="Arial" w:eastAsia="Times New Roman" w:hAnsi="Arial" w:cs="Arial"/>
-          <w:b/>
-          <w:bCs/>
-          <w:color w:val="1F1F1F"/>
-          <w:kern w:val="0"/>
-          <w:bdr w:val="none" w:sz="0" w:space="0" w:color="auto" w:frame="1"/>
-          <w14:ligatures w14:val="none"/>
-        </w:rPr>
-        <w:t>Microscopy</w:t>
-      </w:r>
-    </w:p>
-    <w:p>
-      <w:pPr>
-        <w:spacing w:line="240" w:lineRule="auto"/>
-        <w:jc w:val="center"/>
-        <w:outlineLvl w:val="1"/>
-        <w:rPr>
-          <w:rFonts w:ascii="Arial" w:eastAsia="Times New Roman" w:hAnsi="Arial" w:cs="Arial"/>
-          <w:b/>
-          <w:bCs/>
-          <w:color w:val="1F1F1F"/>
-          <w:kern w:val="0"/>
-          <w:sz w:val="36"/>
-          <w:szCs w:val="36"/>
-          <w14:ligatures w14:val="none"/>
-        </w:rPr>
-      </w:pPr>
-      <w:r>
-        <w:rPr>
-          <w:rFonts w:ascii="Arial" w:eastAsia="Times New Roman" w:hAnsi="Arial" w:cs="Arial"/>
-          <w:b/>
-          <w:bCs/>
-          <w:color w:val="1F1F1F"/>
-          <w:kern w:val="0"/>
-          <w:bdr w:val="none" w:sz="0" w:space="0" w:color="auto" w:frame="1"/>
-          <w14:ligatures w14:val="none"/>
-        </w:rPr>
-        <w:t>AI</w:t>
-      </w:r>
-      <w:r>
-        <w:rPr>
-          <w:rFonts w:ascii="Arial" w:eastAsia="Times New Roman" w:hAnsi="Arial" w:cs="Arial"/>
-          <w:b/>
-          <w:bCs/>
-          <w:color w:val="1F1F1F"/>
-          <w:kern w:val="0"/>
-          <w:bdr w:val="none" w:sz="0" w:space="0" w:color="auto" w:frame="1"/>
-          <w14:ligatures w14:val="none"/>
-        </w:rPr>
-        <w:t xml:space="preserve"> </w:t>
-      </w:r>
-      <w:r>
-        <w:rPr>
-          <w:rFonts w:ascii="Arial" w:eastAsia="Times New Roman" w:hAnsi="Arial" w:cs="Arial"/>
-          <w:b/>
-          <w:bCs/>
-          <w:color w:val="1F1F1F"/>
-          <w:kern w:val="0"/>
-          <w:bdr w:val="none" w:sz="0" w:space="0" w:color="auto" w:frame="1"/>
-          <w14:ligatures w14:val="none"/>
-        </w:rPr>
-        <w:t>Smart</w:t>
-      </w:r>
-      <w:r>
-        <w:rPr>
-          <w:rFonts w:ascii="Arial" w:eastAsia="Times New Roman" w:hAnsi="Arial" w:cs="Arial"/>
-          <w:b/>
-          <w:bCs/>
-          <w:color w:val="1F1F1F"/>
-          <w:kern w:val="0"/>
-          <w:bdr w:val="none" w:sz="0" w:space="0" w:color="auto" w:frame="1"/>
-          <w14:ligatures w14:val="none"/>
-        </w:rPr>
-        <w:t xml:space="preserve"> </w:t>
-      </w:r>
-      <w:r>
-        <w:rPr>
-          <w:rFonts w:ascii="Arial" w:eastAsia="Times New Roman" w:hAnsi="Arial" w:cs="Arial"/>
-          <w:b/>
-          <w:bCs/>
-          <w:color w:val="1F1F1F"/>
-          <w:kern w:val="0"/>
-          <w:bdr w:val="none" w:sz="0" w:space="0" w:color="auto" w:frame="1"/>
-          <w14:ligatures w14:val="none"/>
-        </w:rPr>
-        <w:t>Box</w:t>
-      </w:r>
-      <w:r>
-        <w:rPr>
-          <w:rFonts w:ascii="Arial" w:eastAsia="Times New Roman" w:hAnsi="Arial" w:cs="Arial"/>
-          <w:b/>
-          <w:bCs/>
-          <w:color w:val="1F1F1F"/>
-          <w:kern w:val="0"/>
-          <w:bdr w:val="none" w:sz="0" w:space="0" w:color="auto" w:frame="1"/>
-          <w14:ligatures w14:val="none"/>
-        </w:rPr>
-        <w:t xml:space="preserve"> (</w:t>
-      </w:r>
-      <w:r>
-        <w:rPr>
-          <w:rFonts w:ascii="Arial" w:eastAsia="Times New Roman" w:hAnsi="Arial" w:cs="Arial"/>
-          <w:b/>
-          <w:bCs/>
-          <w:color w:val="1F1F1F"/>
-          <w:kern w:val="0"/>
-          <w:bdr w:val="none" w:sz="0" w:space="0" w:color="auto" w:frame="1"/>
-          <w14:ligatures w14:val="none"/>
-        </w:rPr>
-        <w:t>SAM</w:t>
-      </w:r>
-      <w:r>
-        <w:rPr>
-          <w:rFonts w:ascii="Arial" w:eastAsia="Times New Roman" w:hAnsi="Arial" w:cs="Arial"/>
-          <w:b/>
-          <w:bCs/>
-          <w:color w:val="1F1F1F"/>
-          <w:kern w:val="0"/>
-          <w:bdr w:val="none" w:sz="0" w:space="0" w:color="auto" w:frame="1"/>
-          <w14:ligatures w14:val="none"/>
-        </w:rPr>
-        <w:t xml:space="preserve"> 5-</w:t>
-      </w:r>
-      <w:r>
-        <w:rPr>
-          <w:rFonts w:ascii="Arial" w:eastAsia="Times New Roman" w:hAnsi="Arial" w:cs="Arial"/>
-          <w:b/>
-          <w:bCs/>
-          <w:color w:val="1F1F1F"/>
-          <w:kern w:val="0"/>
-          <w:bdr w:val="none" w:sz="0" w:space="0" w:color="auto" w:frame="1"/>
-          <w14:ligatures w14:val="none"/>
-        </w:rPr>
-        <w:t>Point</w:t>
-      </w:r>
-      <w:r>
-        <w:rPr>
-          <w:rFonts w:ascii="Arial" w:eastAsia="Times New Roman" w:hAnsi="Arial" w:cs="Arial"/>
-          <w:b/>
-          <w:bCs/>
-          <w:color w:val="1F1F1F"/>
-          <w:kern w:val="0"/>
-          <w:bdr w:val="none" w:sz="0" w:space="0" w:color="auto" w:frame="1"/>
-          <w14:ligatures w14:val="none"/>
-        </w:rPr>
-        <w:t xml:space="preserve"> + </w:t>
-      </w:r>
-      <w:r>
-        <w:rPr>
-          <w:rFonts w:ascii="Arial" w:eastAsia="Times New Roman" w:hAnsi="Arial" w:cs="Arial"/>
-          <w:b/>
-          <w:bCs/>
-          <w:color w:val="1F1F1F"/>
-          <w:kern w:val="0"/>
-          <w:bdr w:val="none" w:sz="0" w:space="0" w:color="auto" w:frame="1"/>
-          <w14:ligatures w14:val="none"/>
-        </w:rPr>
-        <w:t>Box</w:t>
-      </w:r>
-      <w:r>
-        <w:rPr>
-          <w:rFonts w:ascii="Arial" w:eastAsia="Times New Roman" w:hAnsi="Arial" w:cs="Arial"/>
-          <w:b/>
-          <w:bCs/>
-          <w:color w:val="1F1F1F"/>
-          <w:kern w:val="0"/>
-          <w:bdr w:val="none" w:sz="0" w:space="0" w:color="auto" w:frame="1"/>
-          <w14:ligatures w14:val="none"/>
-        </w:rPr>
-        <w:t xml:space="preserve"> </w:t>
-      </w:r>
-      <w:r>
-        <w:rPr>
-          <w:rFonts w:ascii="Arial" w:eastAsia="Times New Roman" w:hAnsi="Arial" w:cs="Arial"/>
-          <w:b/>
-          <w:bCs/>
-          <w:color w:val="1F1F1F"/>
-          <w:kern w:val="0"/>
-          <w:bdr w:val="none" w:sz="0" w:space="0" w:color="auto" w:frame="1"/>
-          <w14:ligatures w14:val="none"/>
-        </w:rPr>
-        <w:t>Prompt</w:t>
-      </w:r>
-      <w:r>
-        <w:rPr>
-          <w:rFonts w:ascii="Arial" w:eastAsia="Times New Roman" w:hAnsi="Arial" w:cs="Arial"/>
-          <w:b/>
-          <w:bCs/>
-          <w:color w:val="1F1F1F"/>
-          <w:kern w:val="0"/>
-          <w:bdr w:val="none" w:sz="0" w:space="0" w:color="auto" w:frame="1"/>
-          <w14:ligatures w14:val="none"/>
-        </w:rPr>
-        <w:t xml:space="preserve"> </w:t>
-      </w:r>
-      <w:r>
-        <w:rPr>
-          <w:rFonts w:ascii="Arial" w:eastAsia="Times New Roman" w:hAnsi="Arial" w:cs="Arial"/>
-          <w:b/>
-          <w:bCs/>
-          <w:color w:val="1F1F1F"/>
-          <w:kern w:val="0"/>
-          <w:bdr w:val="none" w:sz="0" w:space="0" w:color="auto" w:frame="1"/>
-          <w:lang w:val="ru-RU"/>
-          <w14:ligatures w14:val="none"/>
-        </w:rPr>
-        <w:t>та</w:t>
-      </w:r>
-      <w:r>
-        <w:rPr>
-          <w:rFonts w:ascii="Arial" w:eastAsia="Times New Roman" w:hAnsi="Arial" w:cs="Arial"/>
-          <w:b/>
-          <w:bCs/>
-          <w:color w:val="1F1F1F"/>
-          <w:kern w:val="0"/>
-          <w:bdr w:val="none" w:sz="0" w:space="0" w:color="auto" w:frame="1"/>
-          <w14:ligatures w14:val="none"/>
-        </w:rPr>
-        <w:t xml:space="preserve"> 72-</w:t>
-      </w:r>
-      <w:proofErr w:type="spellStart"/>
-      <w:r>
-        <w:rPr>
-          <w:rFonts w:ascii="Arial" w:eastAsia="Times New Roman" w:hAnsi="Arial" w:cs="Arial"/>
-          <w:b/>
-          <w:bCs/>
-          <w:color w:val="1F1F1F"/>
-          <w:kern w:val="0"/>
-          <w:bdr w:val="none" w:sz="0" w:space="0" w:color="auto" w:frame="1"/>
-          <w:lang w:val="ru-RU"/>
-          <w14:ligatures w14:val="none"/>
-        </w:rPr>
-        <w:t>променевий</w:t>
-      </w:r>
-      <w:proofErr w:type="spellEnd"/>
+        <w:t>72-ray</w:t>
+      </w:r>
       <w:r>
         <w:rPr>
           <w:rFonts w:ascii="Arial" w:eastAsia="Times New Roman" w:hAnsi="Arial" w:cs="Arial"/>
@@ -812,56 +766,17 @@
     <w:p>
       <w:pPr>
         <w:spacing w:line="240" w:lineRule="auto"/>
-        <w:outlineLvl w:val="2"/>
+        <w:outlineLvl w:val="3"/>
         <w:rPr>
           <w:rFonts w:ascii="Arial" w:eastAsia="Times New Roman" w:hAnsi="Arial" w:cs="Arial"/>
           <w:b/>
           <w:bCs/>
           <w:color w:val="1F1F1F"/>
           <w:kern w:val="0"/>
-          <w:sz w:val="27"/>
-          <w:szCs w:val="27"/>
           <w14:ligatures w14:val="none"/>
         </w:rPr>
       </w:pPr>
       <w:r>
-        <w:rPr>
-          <w:rFonts w:ascii="Arial" w:eastAsia="Times New Roman" w:hAnsi="Arial" w:cs="Arial"/>
-          <w:color w:val="1F1F1F"/>
-          <w:kern w:val="0"/>
-          <w:sz w:val="23"/>
-          <w:szCs w:val="23"/>
-          <w14:ligatures w14:val="none"/>
-        </w:rPr>
-        <w:t xml:space="preserve">1.4. </w:t>
-      </w:r>
-      <w:r>
-        <w:rPr>
-          <w:rFonts w:ascii="Arial" w:eastAsia="Times New Roman" w:hAnsi="Arial" w:cs="Arial"/>
-          <w:color w:val="1F1F1F"/>
-          <w:kern w:val="0"/>
-          <w:sz w:val="23"/>
-          <w:szCs w:val="23"/>
-          <w14:ligatures w14:val="none"/>
-        </w:rPr>
-        <w:t>Automated Optical &amp; Morphological Diagnostics (AI Parameter Advisor — SEM Mode)</w:t>
-      </w:r>
-    </w:p>
-    <w:p>
-      <w:pPr>
-        <w:spacing w:line="240" w:lineRule="auto"/>
-        <w:rPr>
-          <w:rFonts w:ascii="Arial" w:eastAsia="Times New Roman" w:hAnsi="Arial" w:cs="Arial"/>
-          <w:color w:val="1F1F1F"/>
-          <w:kern w:val="0"/>
-          <w14:ligatures w14:val="none"/>
-        </w:rPr>
-      </w:pPr>
-    </w:p>
-    <w:p>
-      <w:pPr>
-        <w:spacing w:line="240" w:lineRule="auto"/>
-        <w:outlineLvl w:val="3"/>
         <w:rPr>
           <w:rFonts w:ascii="Arial" w:eastAsia="Times New Roman" w:hAnsi="Arial" w:cs="Arial"/>
           <w:b/>
@@ -870,17 +785,7 @@
           <w:kern w:val="0"/>
           <w14:ligatures w14:val="none"/>
         </w:rPr>
-      </w:pPr>
-      <w:r>
-        <w:rPr>
-          <w:rFonts w:ascii="Arial" w:eastAsia="Times New Roman" w:hAnsi="Arial" w:cs="Arial"/>
-          <w:b/>
-          <w:bCs/>
-          <w:color w:val="1F1F1F"/>
-          <w:kern w:val="0"/>
-          <w14:ligatures w14:val="none"/>
-        </w:rPr>
-        <w:t>1.4. Automated Optical &amp; Morphological Diagnostics (AI Parameter Advisor — SEM Mode)</w:t>
+        <w:t>Automated Optical &amp; Morphological Diagnostics (AI Parameter Advisor — SEM Mode)</w:t>
       </w:r>
     </w:p>
     <w:p>
@@ -4993,6 +4898,7 @@
           <w:kern w:val="0"/>
           <w14:ligatures w14:val="none"/>
         </w:rPr>
+        <w:lastRenderedPageBreak/>
         <w:br/>
       </w:r>
     </w:p>
@@ -7291,6 +7197,7 @@
     <w:p>
       <w:pPr>
         <w:spacing w:line="240" w:lineRule="auto"/>
+        <w:jc w:val="center"/>
         <w:outlineLvl w:val="2"/>
         <w:rPr>
           <w:rFonts w:ascii="Arial" w:eastAsia="Times New Roman" w:hAnsi="Arial" w:cs="Arial"/>
@@ -7303,7 +7210,12 @@
           <w14:ligatures w14:val="none"/>
         </w:rPr>
       </w:pPr>
-      <w:r>
+    </w:p>
+    <w:p>
+      <w:pPr>
+        <w:spacing w:line="240" w:lineRule="auto"/>
+        <w:jc w:val="center"/>
+        <w:outlineLvl w:val="2"/>
         <w:rPr>
           <w:rFonts w:ascii="Arial" w:eastAsia="Times New Roman" w:hAnsi="Arial" w:cs="Arial"/>
           <w:b/>
@@ -7314,7 +7226,19 @@
           <w:szCs w:val="27"/>
           <w14:ligatures w14:val="none"/>
         </w:rPr>
-        <w:t xml:space="preserve">2.2. Edge-Preserving Crystal Smoothing, Multi-Scale Hierarchical Segmentation </w:t>
+      </w:pPr>
+      <w:r>
+        <w:rPr>
+          <w:rFonts w:ascii="Arial" w:eastAsia="Times New Roman" w:hAnsi="Arial" w:cs="Arial"/>
+          <w:b/>
+          <w:bCs/>
+          <w:color w:val="1F1F1F"/>
+          <w:kern w:val="0"/>
+          <w:sz w:val="27"/>
+          <w:szCs w:val="27"/>
+          <w14:ligatures w14:val="none"/>
+        </w:rPr>
+        <w:t xml:space="preserve">Edge-Preserving Crystal Smoothing, Multi-Scale Hierarchical Segmentation </w:t>
       </w:r>
       <w:proofErr w:type="spellStart"/>
       <w:r>
@@ -7419,7 +7343,7 @@
           <w:kern w:val="0"/>
           <w14:ligatures w14:val="none"/>
         </w:rPr>
-        <w:t>1.2. Edge-Preserving Internal Crystal Smoothing and Hierarchical Multi-Scale Segmentation</w:t>
+        <w:t>Edge-Preserving Internal Crystal Smoothing and Hierarchical Multi-Scale Segmentation</w:t>
       </w:r>
     </w:p>
     <w:p>
@@ -8128,7 +8052,6 @@
             </m:r>
           </m:e>
           <m:sub>
-            <w:proofErr w:type="gramStart"/>
             <m:r>
               <m:rPr>
                 <m:nor/>
@@ -8141,7 +8064,6 @@
               </w:rPr>
               <m:t>base,px</m:t>
             </m:r>
-            <w:proofErr w:type="gramEnd"/>
           </m:sub>
         </m:sSub>
         <m:r>
@@ -8340,7 +8262,6 @@
           <w:kern w:val="0"/>
           <w14:ligatures w14:val="none"/>
         </w:rPr>
-        <w:lastRenderedPageBreak/>
         <w:br/>
       </w:r>
     </w:p>
@@ -8522,7 +8443,6 @@
             </m:r>
           </m:e>
           <m:sub>
-            <w:proofErr w:type="gramStart"/>
             <m:r>
               <m:rPr>
                 <m:nor/>
@@ -8535,7 +8455,6 @@
               </w:rPr>
               <m:t>large,px</m:t>
             </m:r>
-            <w:proofErr w:type="gramEnd"/>
           </m:sub>
         </m:sSub>
         <m:r>
@@ -8603,7 +8522,6 @@
                 </m:r>
               </m:e>
               <m:sub>
-                <w:proofErr w:type="gramStart"/>
                 <m:r>
                   <m:rPr>
                     <m:nor/>
@@ -8616,7 +8534,6 @@
                   </w:rPr>
                   <m:t>base,px</m:t>
                 </m:r>
-                <w:proofErr w:type="gramEnd"/>
               </m:sub>
             </m:sSub>
             <m:r>
@@ -8986,7 +8903,6 @@
             </m:r>
           </m:e>
           <m:sub>
-            <w:proofErr w:type="gramStart"/>
             <m:r>
               <m:rPr>
                 <m:nor/>
@@ -8999,7 +8915,6 @@
               </w:rPr>
               <m:t>small,px</m:t>
             </m:r>
-            <w:proofErr w:type="gramEnd"/>
           </m:sub>
         </m:sSub>
         <m:r>
@@ -9058,7 +8973,6 @@
                 </m:r>
               </m:e>
               <m:sub>
-                <w:proofErr w:type="gramStart"/>
                 <m:r>
                   <m:rPr>
                     <m:nor/>
@@ -9071,7 +8985,6 @@
                   </w:rPr>
                   <m:t>base,px</m:t>
                 </m:r>
-                <w:proofErr w:type="gramEnd"/>
               </m:sub>
             </m:sSub>
             <m:r>
@@ -9709,7 +9622,7 @@
           <w:kern w:val="0"/>
           <w14:ligatures w14:val="none"/>
         </w:rPr>
-        <w:t>1.3. Automated Optical &amp; Morphological Diagnostics (AI Parameter Advisor — Light Microscopy Mode)</w:t>
+        <w:t>Automated Optical &amp; Morphological Diagnostics (AI Parameter Advisor — Light Microscopy Mode)</w:t>
       </w:r>
     </w:p>
     <w:p>
@@ -12056,7 +11969,6 @@
           <w:kern w:val="0"/>
           <w14:ligatures w14:val="none"/>
         </w:rPr>
-        <w:lastRenderedPageBreak/>
         <w:br/>
       </w:r>
     </w:p>
@@ -12194,7 +12106,18 @@
           <w:bdr w:val="none" w:sz="0" w:space="0" w:color="auto" w:frame="1"/>
           <w14:ligatures w14:val="none"/>
         </w:rPr>
-        <w:t xml:space="preserve"> To prevent a few coalesced lobes from inflating the scale while ensuring the </w:t>
+        <w:t xml:space="preserve"> To prevent a few coalesced lobes from inflating the scale while ensuring </w:t>
+      </w:r>
+      <w:r>
+        <w:rPr>
+          <w:rFonts w:ascii="Arial" w:eastAsia="Times New Roman" w:hAnsi="Arial" w:cs="Arial"/>
+          <w:color w:val="1F1F1F"/>
+          <w:kern w:val="0"/>
+          <w:bdr w:val="none" w:sz="0" w:space="0" w:color="auto" w:frame="1"/>
+          <w14:ligatures w14:val="none"/>
+        </w:rPr>
+        <w:lastRenderedPageBreak/>
+        <w:t xml:space="preserve">the </w:t>
       </w:r>
       <m:oMath>
         <m:r>
@@ -14488,15 +14411,6 @@
         <w:spacing w:line="240" w:lineRule="auto"/>
         <w:rPr>
           <w:rFonts w:ascii="Arial" w:eastAsia="Times New Roman" w:hAnsi="Arial" w:cs="Arial"/>
-          <w:color w:val="1F1F1F"/>
-          <w:kern w:val="0"/>
-          <w:bdr w:val="none" w:sz="0" w:space="0" w:color="auto" w:frame="1"/>
-          <w14:ligatures w14:val="none"/>
-        </w:rPr>
-      </w:pPr>
-      <w:r>
-        <w:rPr>
-          <w:rFonts w:ascii="Arial" w:eastAsia="Times New Roman" w:hAnsi="Arial" w:cs="Arial"/>
           <w:b/>
           <w:bCs/>
           <w:color w:val="1F1F1F"/>
@@ -14504,17 +14418,31 @@
           <w:bdr w:val="none" w:sz="0" w:space="0" w:color="auto" w:frame="1"/>
           <w14:ligatures w14:val="none"/>
         </w:rPr>
-        <w:t>Section 3 (Contour Regularization and Human-in-the-Loop Curve Fitting)</w:t>
-      </w:r>
-      <w:r>
-        <w:rPr>
-          <w:rFonts w:ascii="Arial" w:eastAsia="Times New Roman" w:hAnsi="Arial" w:cs="Arial"/>
-          <w:color w:val="1F1F1F"/>
-          <w:kern w:val="0"/>
-          <w:bdr w:val="none" w:sz="0" w:space="0" w:color="auto" w:frame="1"/>
-          <w14:ligatures w14:val="none"/>
-        </w:rPr>
-        <w:t xml:space="preserve"> </w:t>
+      </w:pPr>
+    </w:p>
+    <w:p>
+      <w:pPr>
+        <w:spacing w:line="240" w:lineRule="auto"/>
+        <w:jc w:val="center"/>
+        <w:rPr>
+          <w:rFonts w:ascii="Arial" w:eastAsia="Times New Roman" w:hAnsi="Arial" w:cs="Arial"/>
+          <w:color w:val="1F1F1F"/>
+          <w:kern w:val="0"/>
+          <w:bdr w:val="none" w:sz="0" w:space="0" w:color="auto" w:frame="1"/>
+          <w14:ligatures w14:val="none"/>
+        </w:rPr>
+      </w:pPr>
+      <w:r>
+        <w:rPr>
+          <w:rFonts w:ascii="Arial" w:eastAsia="Times New Roman" w:hAnsi="Arial" w:cs="Arial"/>
+          <w:b/>
+          <w:bCs/>
+          <w:color w:val="1F1F1F"/>
+          <w:kern w:val="0"/>
+          <w:bdr w:val="none" w:sz="0" w:space="0" w:color="auto" w:frame="1"/>
+          <w14:ligatures w14:val="none"/>
+        </w:rPr>
+        <w:t>Contour Regularization and Human-in-the-Loop Curve Fitting)</w:t>
       </w:r>
     </w:p>
     <w:p>
@@ -14552,7 +14480,7 @@
           <w:kern w:val="0"/>
           <w14:ligatures w14:val="none"/>
         </w:rPr>
-        <w:t>3.3. Interactive Box-Prompted Segmentation (SAM 5-Point Prompt &amp; Elliptical Rim Snapper)</w:t>
+        <w:t>Interactive Box-Prompted Segmentation (SAM 5-Point Prompt &amp; Elliptical Rim Snapper)</w:t>
       </w:r>
     </w:p>
     <w:p>
@@ -16545,7 +16473,6 @@
           <w:bdr w:val="none" w:sz="0" w:space="0" w:color="auto" w:frame="1"/>
           <w14:ligatures w14:val="none"/>
         </w:rPr>
-        <w:lastRenderedPageBreak/>
         <w:t xml:space="preserve">It maximizes the composite quality score </w:t>
       </w:r>
       <m:oMath>
@@ -19351,6 +19278,7 @@
     <w:p>
       <w:pPr>
         <w:spacing w:line="240" w:lineRule="auto"/>
+        <w:jc w:val="center"/>
         <w:outlineLvl w:val="3"/>
         <w:rPr>
           <w:rFonts w:ascii="Arial" w:eastAsia="Times New Roman" w:hAnsi="Arial" w:cs="Arial"/>
@@ -19370,7 +19298,7 @@
           <w:kern w:val="0"/>
           <w14:ligatures w14:val="none"/>
         </w:rPr>
-        <w:t>3.4. Single-Click Multi-Scale Seed Growing (</w:t>
+        <w:t>Single-Click Multi-Scale Seed Growing (</w:t>
       </w:r>
       <w:r>
         <w:rPr>
@@ -20350,13 +20278,7 @@
         </w:rPr>
       </w:pPr>
     </w:p>
-    <w:p>
-      <w:pPr>
-        <w:rPr>
-          <w:lang w:val="ru-RU"/>
-        </w:rPr>
-      </w:pPr>
-    </w:p>
+    <w:p/>
     <w:sectPr>
       <w:pgSz w:w="11906" w:h="16838"/>
       <w:pgMar w:top="1440" w:right="1440" w:bottom="1440" w:left="1440" w:header="708" w:footer="708" w:gutter="0"/>

</xml_diff>